<commit_message>
docs(c1a-g1-g2): ghi lần PI chốt lại G1 + chốt G2 14/10 (nút Chot G1/G2 C1a)
- G1: PI chốt lại (reviewed_at 2026-10-14T19:21:13+07:00); A2/A1b/checkpoint dựng lại bởi run_g1_auto của nút.
  A2b KHÔNG kèm — lấy bản đúng ở #129.
- G2: PI điền tên công chúng (#9) + tình trạng sức khoẻ (#12) — bản nháp tiếng Anh (lượt đầu ghi nhầm «9»/«12», đã
  bấm lại); quy trình lưu trữ đơn vị. Điện thoại Hội đồng Y đức: PI gõ số di động cá nhân ⇒ theo lựa chọn của PI thay
  bằng «[PII — điền ở bản nộp ngoài hệ thống]» (repo công khai). Bản nháp đăng ký + Word dựng lại.
- Chấm sống: G0/G1 PASS; G2 13/16 — còn «đăng ký trong nước» (PI tự tra) + 2 mục IRB.

Cần bác sĩ kiểm chứng.

Co-Authored-By: Claude Opus 5.5 <noreply@anthropic.com>
</commit_message>
<xml_diff>
--- a/exports/hai-long-benh-nhan-C1a-BVQY175/G1_A2_PROTOCOL_DESIGN_hai-long-benh-nhan-C1a-BVQY175.docx
+++ b/exports/hai-long-benh-nhan-C1a-BVQY175/G1_A2_PROTOCOL_DESIGN_hai-long-benh-nhan-C1a-BVQY175.docx
@@ -20,7 +20,7 @@
           <w:rFonts w:ascii="Times New Roman" w:hAnsi="Times New Roman" w:eastAsia="Times New Roman"/>
           <w:sz w:val="26"/>
         </w:rPr>
-        <w:t>[BẢN NHÁP TỰ ĐỘNG] | 2026-10-11 13:15</w:t>
+        <w:t>[BẢN NHÁP TỰ ĐỘNG] | 2026-10-14 19:21</w:t>
       </w:r>
     </w:p>
     <w:p>
@@ -60,7 +60,7 @@
           <w:color w:val="CC4400"/>
           <w:sz w:val="26"/>
         </w:rPr>
-        <w:t>&gt; Tạo tự động: 2026-10-11 13:15 | Rule-based; chưa có effect size truy nguyên; giữ nhãn [CẦN]</w:t>
+        <w:t>&gt; Tạo tự động: 2026-10-14 19:21 | Rule-based; chưa có effect size truy nguyên; giữ nhãn [CẦN]</w:t>
       </w:r>
     </w:p>
     <w:p>
@@ -157,7 +157,7 @@
           <w:rFonts w:ascii="Times New Roman" w:hAnsi="Times New Roman" w:eastAsia="Times New Roman"/>
           <w:sz w:val="26"/>
         </w:rPr>
-        <w:t>- Ngày tạo/cập nhật: 2026-10-11 13:15</w:t>
+        <w:t>- Ngày tạo/cập nhật: 2026-10-14 19:21</w:t>
       </w:r>
     </w:p>
     <w:p>
@@ -1052,16 +1052,16 @@
           <w:rFonts w:ascii="Times New Roman" w:hAnsi="Times New Roman" w:eastAsia="Times New Roman"/>
           <w:sz w:val="26"/>
         </w:rPr>
-        <w:t>- SR/MA hiện có: 0</w:t>
-      </w:r>
-    </w:p>
-    <w:p>
-      <w:r>
-        <w:rPr>
-          <w:rFonts w:ascii="Times New Roman" w:hAnsi="Times New Roman" w:eastAsia="Times New Roman"/>
-          <w:sz w:val="26"/>
-        </w:rPr>
-        <w:t>- RCT hiện có: 0</w:t>
+        <w:t>- SR/MA hiện có: 1</w:t>
+      </w:r>
+    </w:p>
+    <w:p>
+      <w:r>
+        <w:rPr>
+          <w:rFonts w:ascii="Times New Roman" w:hAnsi="Times New Roman" w:eastAsia="Times New Roman"/>
+          <w:sz w:val="26"/>
+        </w:rPr>
+        <w:t>- RCT hiện có: 1</w:t>
       </w:r>
     </w:p>
     <w:p>
@@ -1079,7 +1079,7 @@
           <w:rFonts w:ascii="Times New Roman" w:hAnsi="Times New Roman" w:eastAsia="Times New Roman"/>
           <w:sz w:val="26"/>
         </w:rPr>
-        <w:t>- Mức độ evidence: CÓ NỀN QUAN SÁT — ~12 hit của bộ lọc quan sát (CHƯA sàng lọc mức liên quan), không thấy RCT/SR trong PubMed, truy vấn G0 «patient satisfaction outpatient department Vietnam hospital»</w:t>
+        <w:t>- Mức độ evidence: TRUNG BÌNH — có 1 SR/MA</w:t>
       </w:r>
     </w:p>
     <w:p>
@@ -1731,7 +1731,7 @@
           <w:color w:val="CC4400"/>
           <w:sz w:val="26"/>
         </w:rPr>
-        <w:t>Phần mềm: [ ] R  [ ] Stata  [ ] SPSS  | Seed ngẫu nhiên: 20261011 [CẦN BÁC SĨ XÁC NHẬN — gợi ý tự sinh từ ngày chạy]</w:t>
+        <w:t>Phần mềm: [ ] R  [ ] Stata  [ ] SPSS  | Seed ngẫu nhiên: 20261014 [CẦN BÁC SĨ XÁC NHẬN — gợi ý tự sinh từ ngày chạy]</w:t>
       </w:r>
     </w:p>
     <w:p>
@@ -2077,7 +2077,7 @@
           <w:color w:val="CC4400"/>
           <w:sz w:val="26"/>
         </w:rPr>
-        <w:t>Random seed: 20261011 [CẦN XÁC NHẬN nếu có bước ngẫu nhiên/mô phỏng]</w:t>
+        <w:t>Random seed: 20261014 [CẦN XÁC NHẬN nếu có bước ngẫu nhiên/mô phỏng]</w:t>
       </w:r>
     </w:p>
     <w:p>
@@ -2710,7 +2710,7 @@
           <w:rFonts w:ascii="Times New Roman" w:hAnsi="Times New Roman" w:eastAsia="Times New Roman"/>
           <w:sz w:val="26"/>
         </w:rPr>
-        <w:t xml:space="preserve">  Ngày soạn SAP: 2026-10-11</w:t>
+        <w:t xml:space="preserve">  Ngày soạn SAP: 2026-10-14</w:t>
       </w:r>
     </w:p>
     <w:p>

</xml_diff>